<commit_message>
cập nhật sửa đổi 25/05/2025
</commit_message>
<xml_diff>
--- a/tài liệu/KỊCH BẢN THUYẾT TRÌNH V2.docx
+++ b/tài liệu/KỊCH BẢN THUYẾT TRÌNH V2.docx
@@ -352,6 +352,57 @@
           <w:numId w:val="4"/>
         </w:numPr>
       </w:pPr>
+      <w:r>
+        <w:t>Fourier Transform</w:t>
+      </w:r>
+    </w:p>
+    <w:p>
+      <w:pPr>
+        <w:pStyle w:val="ListParagraph"/>
+        <w:numPr>
+          <w:ilvl w:val="1"/>
+          <w:numId w:val="4"/>
+        </w:numPr>
+      </w:pPr>
+      <w:r>
+        <w:t>Chuyển về thang Mel</w:t>
+      </w:r>
+    </w:p>
+    <w:p>
+      <w:pPr>
+        <w:pStyle w:val="ListParagraph"/>
+        <w:numPr>
+          <w:ilvl w:val="1"/>
+          <w:numId w:val="4"/>
+        </w:numPr>
+      </w:pPr>
+      <w:r>
+        <w:t>Chuyển về phổ công suất</w:t>
+      </w:r>
+    </w:p>
+    <w:p>
+      <w:pPr>
+        <w:pStyle w:val="ListParagraph"/>
+        <w:numPr>
+          <w:ilvl w:val="1"/>
+          <w:numId w:val="4"/>
+        </w:numPr>
+      </w:pPr>
+      <w:r>
+        <w:t>Áp dụng bộ lọc tam giác và lấy log</w:t>
+      </w:r>
+    </w:p>
+    <w:p>
+      <w:pPr>
+        <w:pStyle w:val="ListParagraph"/>
+        <w:numPr>
+          <w:ilvl w:val="1"/>
+          <w:numId w:val="4"/>
+        </w:numPr>
+      </w:pPr>
+      <w:r>
+        <w:t>Biến đổi cosin rời rạc</w:t>
+      </w:r>
     </w:p>
     <w:p>
       <w:pPr>
@@ -362,6 +413,11 @@
       </w:r>
     </w:p>
     <w:p>
+      <w:pPr>
+        <w:rPr>
+          <w:lang w:val="vi-VN"/>
+        </w:rPr>
+      </w:pPr>
       <w:r>
         <w:t>Nội dung:</w:t>
       </w:r>
@@ -372,15 +428,132 @@
     </w:p>
     <w:p>
       <w:pPr>
+        <w:rPr>
+          <w:lang w:val="vi-VN"/>
+        </w:rPr>
+      </w:pPr>
+      <w:r>
+        <w:rPr>
+          <w:lang w:val="vi-VN"/>
+        </w:rPr>
+        <w:lastRenderedPageBreak/>
+        <w:t xml:space="preserve">Dữ liệu được trích xuất </w:t>
+      </w:r>
+      <w:r>
+        <w:rPr>
+          <w:lang w:val="vi-VN"/>
+        </w:rPr>
+        <w:t>là một chuỗi thời gian</w:t>
+      </w:r>
+    </w:p>
+    <w:p>
+      <w:pPr>
+        <w:rPr>
+          <w:lang w:val="vi-VN"/>
+        </w:rPr>
+      </w:pPr>
+      <w:r>
+        <w:rPr>
+          <w:lang w:val="vi-VN"/>
+        </w:rPr>
+        <w:t xml:space="preserve">Nên mô hình ở pha phân lớp sẽ là mô hình học chuỗi thời </w:t>
+      </w:r>
+      <w:r>
+        <w:rPr>
+          <w:lang w:val="vi-VN"/>
+        </w:rPr>
+        <w:t xml:space="preserve">gian, để học thông tin ngữ cảnh, mối liên hệ giữa các điểm dữ liệu trong chuỗi thời gian </w:t>
+      </w:r>
+    </w:p>
+    <w:p>
+      <w:pPr>
         <w:pStyle w:val="Heading2"/>
-      </w:pPr>
-      <w:r>
+        <w:rPr>
+          <w:lang w:val="vi-VN"/>
+        </w:rPr>
+      </w:pPr>
+      <w:r>
+        <w:rPr>
+          <w:lang w:val="vi-VN"/>
+        </w:rPr>
         <w:t xml:space="preserve">Slide </w:t>
       </w:r>
     </w:p>
     <w:p>
-      <w:r>
-        <w:t xml:space="preserve">Nội dung: </w:t>
+      <w:pPr>
+        <w:rPr>
+          <w:lang w:val="vi-VN"/>
+        </w:rPr>
+      </w:pPr>
+      <w:r>
+        <w:rPr>
+          <w:lang w:val="vi-VN"/>
+        </w:rPr>
+        <w:t xml:space="preserve">Nội dung: </w:t>
+      </w:r>
+      <w:r>
+        <w:rPr>
+          <w:lang w:val="vi-VN"/>
+        </w:rPr>
+        <w:t xml:space="preserve">Lý do chọn LSTM </w:t>
+      </w:r>
+    </w:p>
+    <w:p>
+      <w:r>
+        <w:rPr>
+          <w:lang w:val="vi-VN"/>
+        </w:rPr>
+        <w:t xml:space="preserve">Ngoài LSTM RNN cũng là mô hình học chuỗi thời gian nhưng bị ảnh hưởng bởi hiện tượng gradient vanishing dẫn đến các </w:t>
+      </w:r>
+    </w:p>
+    <w:p>
+      <w:pPr>
+        <w:pStyle w:val="Heading2"/>
+        <w:rPr>
+          <w:lang w:val="vi-VN"/>
+        </w:rPr>
+      </w:pPr>
+      <w:r>
+        <w:rPr>
+          <w:lang w:val="vi-VN"/>
+        </w:rPr>
+        <w:t xml:space="preserve">Slide </w:t>
+      </w:r>
+    </w:p>
+    <w:p>
+      <w:pPr>
+        <w:rPr>
+          <w:lang w:val="vi-VN"/>
+        </w:rPr>
+      </w:pPr>
+      <w:r>
+        <w:rPr>
+          <w:lang w:val="vi-VN"/>
+        </w:rPr>
+        <w:t>Nội dung: Sơ đồ mô hình tổng quan</w:t>
+      </w:r>
+    </w:p>
+    <w:p>
+      <w:pPr>
+        <w:pStyle w:val="Heading2"/>
+      </w:pPr>
+      <w:r>
+        <w:t xml:space="preserve">Slide </w:t>
+      </w:r>
+    </w:p>
+    <w:p>
+      <w:r>
+        <w:t>Nội dung:</w:t>
+      </w:r>
+    </w:p>
+    <w:p>
+      <w:r>
+        <w:t>Các mô hình dùng cho thực nghiệm: Mô hình LSTM, RNN, Random Forest, SVM</w:t>
+      </w:r>
+    </w:p>
+    <w:p>
+      <w:r>
+        <w:t>Chiến lược huấn luyện: Mô hình LSTM và mô hình RNN sẽ dùng toàn bộ các bộ đặc trưng MFCC, mô hình Random Forest và mô hình SVM sẽ dùng vector đặc trưng được tạo bởi trung bình cộng của các vector đặc trưng trong chuỗi thời gian + Độ lệch chuẩn của chúng</w:t>
       </w:r>
     </w:p>
     <w:p>
@@ -389,11 +562,20 @@
       </w:r>
     </w:p>
     <w:p>
+      <w:r>
+        <w:t>Dữ liệu thực nghiệm: Bộ SceneFake, bảng thống kê dữ liệu thực nghiệm</w:t>
+      </w:r>
+    </w:p>
+    <w:p>
+      <w:r>
+        <w:t>Môi trường thực nghiệm: Cấu hình máy tính, phần mềm để cài đặt và huấn luyện</w:t>
+      </w:r>
+    </w:p>
+    <w:p>
       <w:pPr>
         <w:pStyle w:val="Heading2"/>
       </w:pPr>
       <w:r>
-        <w:lastRenderedPageBreak/>
         <w:t xml:space="preserve">Slide </w:t>
       </w:r>
     </w:p>
@@ -405,6 +587,14 @@
         <w:br/>
         <w:t>Kết quả thực nghiệm</w:t>
       </w:r>
+      <w:r>
+        <w:t xml:space="preserve"> </w:t>
+      </w:r>
+    </w:p>
+    <w:p>
+      <w:r>
+        <w:t>Bảng kết quả thực nghiệm</w:t>
+      </w:r>
     </w:p>
     <w:p>
       <w:pPr>
@@ -417,6 +607,11 @@
     <w:p>
       <w:r>
         <w:t>Nội dung:</w:t>
+      </w:r>
+    </w:p>
+    <w:p>
+      <w:r>
+        <w:t>Biểu đồ kết quả thực nghiệm kèm nhận xét, lý giải tại sao SVM, Random Forest lại tốt, LSTM, RNN lại không tốt</w:t>
       </w:r>
       <w:r>
         <w:br/>
@@ -428,6 +623,7 @@
         <w:pStyle w:val="Heading2"/>
       </w:pPr>
       <w:r>
+        <w:lastRenderedPageBreak/>
         <w:t xml:space="preserve">Slide </w:t>
       </w:r>
     </w:p>
@@ -472,6 +668,118 @@
 <file path=word/numbering.xml><?xml version="1.0" encoding="utf-8"?>
 <w:numbering xmlns:wpc="http://schemas.microsoft.com/office/word/2010/wordprocessingCanvas" xmlns:cx="http://schemas.microsoft.com/office/drawing/2014/chartex" xmlns:cx1="http://schemas.microsoft.com/office/drawing/2015/9/8/chartex" xmlns:cx2="http://schemas.microsoft.com/office/drawing/2015/10/21/chartex" xmlns:cx3="http://schemas.microsoft.com/office/drawing/2016/5/9/chartex" xmlns:cx4="http://schemas.microsoft.com/office/drawing/2016/5/10/chartex" xmlns:cx5="http://schemas.microsoft.com/office/drawing/2016/5/11/chartex" xmlns:cx6="http://schemas.microsoft.com/office/drawing/2016/5/12/chartex" xmlns:cx7="http://schemas.microsoft.com/office/drawing/2016/5/13/chartex" xmlns:cx8="http://schemas.microsoft.com/office/drawing/2016/5/14/chartex" xmlns:mc="http://schemas.openxmlformats.org/markup-compatibility/2006" xmlns:aink="http://schemas.microsoft.com/office/drawing/2016/ink" xmlns:am3d="http://schemas.microsoft.com/office/drawing/2017/model3d" xmlns:o="urn:schemas-microsoft-com:office:office" xmlns:oel="http://schemas.microsoft.com/office/2019/extlst" xmlns:r="http://schemas.openxmlformats.org/officeDocument/2006/relationships" xmlns:m="http://schemas.openxmlformats.org/officeDocument/2006/math" xmlns:v="urn:schemas-microsoft-com:vml" xmlns:wp14="http://schemas.microsoft.com/office/word/2010/wordprocessingDrawing" xmlns:wp="http://schemas.openxmlformats.org/drawingml/2006/wordprocessingDrawing" xmlns:w10="urn:schemas-microsoft-com:office:word" xmlns:w="http://schemas.openxmlformats.org/wordprocessingml/2006/main" xmlns:w14="http://schemas.microsoft.com/office/word/2010/wordml" xmlns:w15="http://schemas.microsoft.com/office/word/2012/wordml" xmlns:w16cex="http://schemas.microsoft.com/office/word/2018/wordml/cex" xmlns:w16cid="http://schemas.microsoft.com/office/word/2016/wordml/cid" xmlns:w16="http://schemas.microsoft.com/office/word/2018/wordml" xmlns:w16du="http://schemas.microsoft.com/office/word/2023/wordml/word16du" xmlns:w16sdtdh="http://schemas.microsoft.com/office/word/2020/wordml/sdtdatahash" xmlns:w16sdtfl="http://schemas.microsoft.com/office/word/2024/wordml/sdtformatlock" xmlns:w16se="http://schemas.microsoft.com/office/word/2015/wordml/symex" xmlns:wpg="http://schemas.microsoft.com/office/word/2010/wordprocessingGroup" xmlns:wpi="http://schemas.microsoft.com/office/word/2010/wordprocessingInk" xmlns:wne="http://schemas.microsoft.com/office/word/2006/wordml" xmlns:wps="http://schemas.microsoft.com/office/word/2010/wordprocessingShape" mc:Ignorable="w14 w15 w16se w16cid w16 w16cex w16sdtdh w16sdtfl w16du wp14">
   <w:abstractNum w:abstractNumId="0" w15:restartNumberingAfterBreak="0">
+    <w:nsid w:val="0F514E49"/>
+    <w:multiLevelType w:val="hybridMultilevel"/>
+    <w:tmpl w:val="FD122F4A"/>
+    <w:lvl w:ilvl="0" w:tplc="9830E594">
+      <w:numFmt w:val="bullet"/>
+      <w:lvlText w:val=""/>
+      <w:lvlJc w:val="left"/>
+      <w:pPr>
+        <w:ind w:left="720" w:hanging="360"/>
+      </w:pPr>
+      <w:rPr>
+        <w:rFonts w:ascii="Wingdings" w:eastAsiaTheme="minorHAnsi" w:hAnsi="Wingdings" w:cstheme="minorBidi" w:hint="default"/>
+      </w:rPr>
+    </w:lvl>
+    <w:lvl w:ilvl="1" w:tplc="04090003" w:tentative="1">
+      <w:start w:val="1"/>
+      <w:numFmt w:val="bullet"/>
+      <w:lvlText w:val="o"/>
+      <w:lvlJc w:val="left"/>
+      <w:pPr>
+        <w:ind w:left="1440" w:hanging="360"/>
+      </w:pPr>
+      <w:rPr>
+        <w:rFonts w:ascii="Courier New" w:hAnsi="Courier New" w:cs="Courier New" w:hint="default"/>
+      </w:rPr>
+    </w:lvl>
+    <w:lvl w:ilvl="2" w:tplc="04090005" w:tentative="1">
+      <w:start w:val="1"/>
+      <w:numFmt w:val="bullet"/>
+      <w:lvlText w:val=""/>
+      <w:lvlJc w:val="left"/>
+      <w:pPr>
+        <w:ind w:left="2160" w:hanging="360"/>
+      </w:pPr>
+      <w:rPr>
+        <w:rFonts w:ascii="Wingdings" w:hAnsi="Wingdings" w:hint="default"/>
+      </w:rPr>
+    </w:lvl>
+    <w:lvl w:ilvl="3" w:tplc="04090001" w:tentative="1">
+      <w:start w:val="1"/>
+      <w:numFmt w:val="bullet"/>
+      <w:lvlText w:val=""/>
+      <w:lvlJc w:val="left"/>
+      <w:pPr>
+        <w:ind w:left="2880" w:hanging="360"/>
+      </w:pPr>
+      <w:rPr>
+        <w:rFonts w:ascii="Symbol" w:hAnsi="Symbol" w:hint="default"/>
+      </w:rPr>
+    </w:lvl>
+    <w:lvl w:ilvl="4" w:tplc="04090003" w:tentative="1">
+      <w:start w:val="1"/>
+      <w:numFmt w:val="bullet"/>
+      <w:lvlText w:val="o"/>
+      <w:lvlJc w:val="left"/>
+      <w:pPr>
+        <w:ind w:left="3600" w:hanging="360"/>
+      </w:pPr>
+      <w:rPr>
+        <w:rFonts w:ascii="Courier New" w:hAnsi="Courier New" w:cs="Courier New" w:hint="default"/>
+      </w:rPr>
+    </w:lvl>
+    <w:lvl w:ilvl="5" w:tplc="04090005" w:tentative="1">
+      <w:start w:val="1"/>
+      <w:numFmt w:val="bullet"/>
+      <w:lvlText w:val=""/>
+      <w:lvlJc w:val="left"/>
+      <w:pPr>
+        <w:ind w:left="4320" w:hanging="360"/>
+      </w:pPr>
+      <w:rPr>
+        <w:rFonts w:ascii="Wingdings" w:hAnsi="Wingdings" w:hint="default"/>
+      </w:rPr>
+    </w:lvl>
+    <w:lvl w:ilvl="6" w:tplc="04090001" w:tentative="1">
+      <w:start w:val="1"/>
+      <w:numFmt w:val="bullet"/>
+      <w:lvlText w:val=""/>
+      <w:lvlJc w:val="left"/>
+      <w:pPr>
+        <w:ind w:left="5040" w:hanging="360"/>
+      </w:pPr>
+      <w:rPr>
+        <w:rFonts w:ascii="Symbol" w:hAnsi="Symbol" w:hint="default"/>
+      </w:rPr>
+    </w:lvl>
+    <w:lvl w:ilvl="7" w:tplc="04090003" w:tentative="1">
+      <w:start w:val="1"/>
+      <w:numFmt w:val="bullet"/>
+      <w:lvlText w:val="o"/>
+      <w:lvlJc w:val="left"/>
+      <w:pPr>
+        <w:ind w:left="5760" w:hanging="360"/>
+      </w:pPr>
+      <w:rPr>
+        <w:rFonts w:ascii="Courier New" w:hAnsi="Courier New" w:cs="Courier New" w:hint="default"/>
+      </w:rPr>
+    </w:lvl>
+    <w:lvl w:ilvl="8" w:tplc="04090005" w:tentative="1">
+      <w:start w:val="1"/>
+      <w:numFmt w:val="bullet"/>
+      <w:lvlText w:val=""/>
+      <w:lvlJc w:val="left"/>
+      <w:pPr>
+        <w:ind w:left="6480" w:hanging="360"/>
+      </w:pPr>
+      <w:rPr>
+        <w:rFonts w:ascii="Wingdings" w:hAnsi="Wingdings" w:hint="default"/>
+      </w:rPr>
+    </w:lvl>
+  </w:abstractNum>
+  <w:abstractNum w:abstractNumId="1" w15:restartNumberingAfterBreak="0">
     <w:nsid w:val="1CE077F7"/>
     <w:multiLevelType w:val="hybridMultilevel"/>
     <w:tmpl w:val="224E61D8"/>
@@ -584,7 +892,7 @@
       </w:rPr>
     </w:lvl>
   </w:abstractNum>
-  <w:abstractNum w:abstractNumId="1" w15:restartNumberingAfterBreak="0">
+  <w:abstractNum w:abstractNumId="2" w15:restartNumberingAfterBreak="0">
     <w:nsid w:val="4EA308A0"/>
     <w:multiLevelType w:val="hybridMultilevel"/>
     <w:tmpl w:val="1188096A"/>
@@ -697,7 +1005,7 @@
       </w:rPr>
     </w:lvl>
   </w:abstractNum>
-  <w:abstractNum w:abstractNumId="2" w15:restartNumberingAfterBreak="0">
+  <w:abstractNum w:abstractNumId="3" w15:restartNumberingAfterBreak="0">
     <w:nsid w:val="62CD1412"/>
     <w:multiLevelType w:val="hybridMultilevel"/>
     <w:tmpl w:val="4BDA6942"/>
@@ -810,7 +1118,7 @@
       </w:rPr>
     </w:lvl>
   </w:abstractNum>
-  <w:abstractNum w:abstractNumId="3" w15:restartNumberingAfterBreak="0">
+  <w:abstractNum w:abstractNumId="4" w15:restartNumberingAfterBreak="0">
     <w:nsid w:val="79FF0444"/>
     <w:multiLevelType w:val="hybridMultilevel"/>
     <w:tmpl w:val="B75E1ECA"/>
@@ -924,16 +1232,19 @@
     </w:lvl>
   </w:abstractNum>
   <w:num w:numId="1" w16cid:durableId="209808318">
-    <w:abstractNumId w:val="0"/>
+    <w:abstractNumId w:val="1"/>
   </w:num>
   <w:num w:numId="2" w16cid:durableId="1510872878">
+    <w:abstractNumId w:val="3"/>
+  </w:num>
+  <w:num w:numId="3" w16cid:durableId="1660308471">
+    <w:abstractNumId w:val="4"/>
+  </w:num>
+  <w:num w:numId="4" w16cid:durableId="1111438050">
     <w:abstractNumId w:val="2"/>
   </w:num>
-  <w:num w:numId="3" w16cid:durableId="1660308471">
-    <w:abstractNumId w:val="3"/>
-  </w:num>
-  <w:num w:numId="4" w16cid:durableId="1111438050">
-    <w:abstractNumId w:val="1"/>
+  <w:num w:numId="5" w16cid:durableId="643002553">
+    <w:abstractNumId w:val="0"/>
   </w:num>
 </w:numbering>
 </file>
@@ -1542,6 +1853,7 @@
   <w:style w:type="character" w:default="1" w:styleId="DefaultParagraphFont">
     <w:name w:val="Default Paragraph Font"/>
     <w:uiPriority w:val="1"/>
+    <w:semiHidden/>
     <w:unhideWhenUsed/>
   </w:style>
   <w:style w:type="table" w:default="1" w:styleId="TableNormal">
@@ -2193,4 +2505,16 @@
     </a:ext>
   </a:extLst>
 </a:theme>
+</file>
+
+<file path=customXml/item1.xml><?xml version="1.0" encoding="utf-8"?>
+<b:Sources xmlns:b="http://schemas.openxmlformats.org/officeDocument/2006/bibliography" xmlns="http://schemas.openxmlformats.org/officeDocument/2006/bibliography" SelectedStyle="\IEEE2006OfficeOnline.xsl" StyleName="IEEE" Version="2006"/>
+</file>
+
+<file path=customXml/itemProps1.xml><?xml version="1.0" encoding="utf-8"?>
+<ds:datastoreItem xmlns:ds="http://schemas.openxmlformats.org/officeDocument/2006/customXml" ds:itemID="{4BCD896A-C8EC-4E98-8D04-D19292CB9D73}">
+  <ds:schemaRefs>
+    <ds:schemaRef ds:uri="http://schemas.openxmlformats.org/officeDocument/2006/bibliography"/>
+  </ds:schemaRefs>
+</ds:datastoreItem>
 </file>
</xml_diff>